<commit_message>
docs: renombrar sistema a 'Sistema de Gestión Liceo Juvenal Hernández Jaque'
Co-Authored-By: Claude Sonnet 4.6 <noreply@anthropic.com>
</commit_message>
<xml_diff>
--- a/Manual_Usuario_Inventario_LiceoJHJ.docx
+++ b/Manual_Usuario_Inventario_LiceoJHJ.docx
@@ -81,7 +81,7 @@
                 <w:sz w:val="40"/>
                 <w:szCs w:val="40"/>
               </w:rPr>
-              <w:t xml:space="preserve">LICEO JHJ</w:t>
+              <w:t xml:space="preserve">LICEO JUVENAL HERNANDEZ JAQUE</w:t>
             </w:r>
           </w:p>
           <w:p>
@@ -129,7 +129,7 @@
                 <w:sz w:val="36"/>
                 <w:szCs w:val="36"/>
               </w:rPr>
-              <w:t xml:space="preserve">Sistema de Inventario</w:t>
+              <w:t xml:space="preserve">Sistema de Gestión</w:t>
             </w:r>
           </w:p>
           <w:p>
@@ -146,7 +146,7 @@
                 <w:sz w:val="36"/>
                 <w:szCs w:val="36"/>
               </w:rPr>
-              <w:t xml:space="preserve">Liceo JHJ</w:t>
+              <w:t xml:space="preserve">Liceo Juvenal Hernández Jaque</w:t>
             </w:r>
           </w:p>
           <w:p>
@@ -3004,7 +3004,7 @@
           <w:sz w:val="28"/>
           <w:szCs w:val="28"/>
         </w:rPr>
-        <w:t xml:space="preserve">1.1 ¿Qué es el Sistema Inventario Liceo JHJ?</w:t>
+        <w:t xml:space="preserve">1.1 ¿Qué es el Sistema de Gestión Liceo Juvenal Hernández Jaque?</w:t>
       </w:r>
       <w:bookmarkEnd w:id="1"/>
     </w:p>
@@ -3019,7 +3019,7 @@
           <w:sz w:val="22"/>
           <w:szCs w:val="22"/>
         </w:rPr>
-        <w:t xml:space="preserve">El Sistema de Inventario Liceo JHJ es una plataforma web institucional que centraliza la gestión del inventario de bienes, los requerimientos de soporte técnico (tickets), las solicitudes de compra, las ausencias del personal, los días compensatorios y los usuarios del establecimiento.</w:t>
+        <w:t xml:space="preserve">El Sistema de Gestión Liceo Juvenal Hernández Jaque es una plataforma web institucional que centraliza la gestión del inventario de bienes, los requerimientos de soporte técnico (tickets), las solicitudes de compra, las ausencias del personal, los días compensatorios y los usuarios del establecimiento.</w:t>
       </w:r>
     </w:p>
     <w:p>
@@ -29822,7 +29822,7 @@
           <w:sz w:val="22"/>
           <w:szCs w:val="22"/>
         </w:rPr>
-        <w:t xml:space="preserve">Nombre del sistema: título que aparece en el encabezado (ej: "Inventario Liceo JHJ")</w:t>
+        <w:t xml:space="preserve">Nombre del sistema: título que aparece en el encabezado (ej: "Sistema de Gestión Liceo JHJ")</w:t>
       </w:r>
     </w:p>
     <w:p>
@@ -34440,7 +34440,7 @@
         <w:sz w:val="18"/>
         <w:szCs w:val="18"/>
       </w:rPr>
-      <w:t xml:space="preserve">Sistema Inventario Liceo JHJ</w:t>
+      <w:t xml:space="preserve">Sistema de Gestión Liceo Juvenal Hernández Jaque</w:t>
     </w:r>
   </w:p>
 </w:hdr>

</xml_diff>